<commit_message>
docs: update project requirements and planning documentation
</commit_message>
<xml_diff>
--- a/documentation/CoolAgent_Plan_de_Proyecto.docx
+++ b/documentation/CoolAgent_Plan_de_Proyecto.docx
@@ -568,7 +568,7 @@
                 <w:sz w:val="20"/>
                 <w:szCs w:val="20"/>
               </w:rPr>
-              <w:t xml:space="preserve">Gemini Flash (API) o Claude Haiku vía AWS Bedrock</w:t>
+              <w:t xml:space="preserve">Gemini Flash (API) o Claude Haiku 4.5 vía AWS Bedrock</w:t>
             </w:r>
           </w:p>
         </w:tc>
@@ -3056,7 +3056,7 @@
           <w:sz w:val="20"/>
           <w:szCs w:val="20"/>
         </w:rPr>
-        <w:t xml:space="preserve">Llama 3.2 (8B) o Mistral 7B - respuestas rápidas para desarrollo</w:t>
+        <w:t xml:space="preserve">Qwen 3.5 (9B) o Mistral 7B - respuestas rápidas para desarrollo</w:t>
       </w:r>
     </w:p>
     <w:p>
@@ -3086,7 +3086,7 @@
           <w:sz w:val="20"/>
           <w:szCs w:val="20"/>
         </w:rPr>
-        <w:t xml:space="preserve">Llava 1.6 o Qwen2.5-VL-7B - análisis de imágenes local</w:t>
+        <w:t xml:space="preserve">Qwen2.5-VL 7B - análisis de imágenes local</w:t>
       </w:r>
     </w:p>
     <w:p>
@@ -9371,7 +9371,7 @@
                 <w:sz w:val="20"/>
                 <w:szCs w:val="20"/>
               </w:rPr>
-              <w:t xml:space="preserve">Claude Haiku / Llama (~1K consultas/día)</w:t>
+              <w:t xml:space="preserve">Claude Haiku 4.5 / Qwen (~1K consultas/día)</w:t>
             </w:r>
           </w:p>
         </w:tc>
@@ -9792,7 +9792,7 @@
           <w:sz w:val="20"/>
           <w:szCs w:val="20"/>
         </w:rPr>
-        <w:t xml:space="preserve">Preguntas simples van a modelos baratos (Haiku/Llama). Solo consultas complejas o de imagen van a modelos premium.</w:t>
+        <w:t xml:space="preserve">Preguntas simples van a modelos baratos (Haiku/Qwen). Solo consultas complejas o de imagen van a modelos premium.</w:t>
       </w:r>
     </w:p>
     <w:p>

</xml_diff>